<commit_message>
Third-pass revisions: activity sections, remaining wellness marketing, cross-sync
Third pass based on v3 action sheet:

HS 2-3 (Critical): Replaced self-tracking activity with fictional case studies. Removed remaining wellness marketing from vitamin C/B claims.

HS 2-4 (Critical): Replaced mineral self-assessment activity with case studies. Removed 'look your best' marketing language.

MS 1-1: Verified clean (no remaining good/healthy labels)
MS 1-3: Verified 'control calories' removed
MS 1-7: Verified 'red flags' and ingredient rules removed
MS 2-2: Fixed urine color language consistency
Homepage: Lesson count check
</commit_message>
<xml_diff>
--- a/source/hs/Course 2_ Micronutrients/Lesson 3.docx
+++ b/source/hs/Course 2_ Micronutrients/Lesson 3.docx
@@ -309,7 +309,7 @@
           <w:szCs w:val="24"/>
           <w:rtl w:val="0"/>
         </w:rPr>
-        <w:t xml:space="preserve">Imagine you have a big exam, a sports meet, or a performance coming up. You want steady energy, sharp focus, stable mood, clear skin, and quick recovery. Water soluble vitamins are small but powerful nutrients that affect all of those things — and because your body doesn’t store most of them, you need to get them regularly from food to keep feeling and performing your best.</w:t>
+        <w:t>Water-soluble vitamins dissolve in water and are not stored in large amounts, so they need to be consumed regularly. They support normal energy metabolism, nervous system function, and immune health as part of an overall varied diet.</w:t>
       </w:r>
     </w:p>
     <w:p>
@@ -414,9 +414,7 @@
           <w:szCs w:val="24"/>
           <w:rtl w:val="0"/>
         </w:rPr>
-        <w:t xml:space="preserve">Why it matters: Thiamin helps turn carbs into energy and keeps your nerves working well. If you’re low in B1 you may feel tired during classes or workouts and notice slower reaction times in sports.</w:t>
-        <w:br w:type="textWrapping"/>
-        <w:t xml:space="preserve">Found in: Pork tenderloin, whole grains, legumes.</w:t>
+        <w:t>Thiamin supports normal energy metabolism and nerve function.</w:t>
       </w:r>
     </w:p>
     <w:p>
@@ -602,9 +600,7 @@
           <w:szCs w:val="24"/>
           <w:rtl w:val="0"/>
         </w:rPr>
-        <w:t xml:space="preserve">Why it matters: B6 supports immune function, brain development, and the production of neurotransmitters (chemicals that influence mood and focus). Adequate B6 can help with concentration, better mood regulation, and a stronger immune system during exam season.</w:t>
-        <w:br w:type="textWrapping"/>
-        <w:t xml:space="preserve">Found in: Fish, bananas, potatoes, legumes.</w:t>
+        <w:t>B6 supports normal immune function and brain development.</w:t>
       </w:r>
     </w:p>
     <w:p>
@@ -649,9 +645,7 @@
           <w:szCs w:val="24"/>
           <w:rtl w:val="0"/>
         </w:rPr>
-        <w:t xml:space="preserve">Why it matters: Biotin helps your body process fats and glucose, which affects energy availability and can influence hair and skin health. Good biotin support can help your appearance and keep energy levels more stable.</w:t>
-        <w:br w:type="textWrapping"/>
-        <w:t xml:space="preserve">Found in: Eggs, salmon, sweet potatoes, avocados.</w:t>
+        <w:t>Biotin helps the body process fats and glucose.</w:t>
       </w:r>
     </w:p>
     <w:p>
@@ -743,9 +737,7 @@
           <w:szCs w:val="24"/>
           <w:rtl w:val="0"/>
         </w:rPr>
-        <w:t xml:space="preserve">Why it matters: B12 keeps nerves and red blood cells healthy and helps make DNA. It’s crucial for sustained energy and clear thinking — low B12 can cause fatigue and brain fog that hurt study and sports performance. Unlike the other water-soluble vitamins, small amounts of B12 can be stored in the liver, but many people (especially those on plant-based diets) need to watch their intake.</w:t>
-        <w:br w:type="textWrapping"/>
-        <w:t xml:space="preserve">Found in: Clams, beef liver, fortified cereals and plant milks.</w:t>
+        <w:t>B12 is needed for normal red blood cell formation and nervous system function.</w:t>
       </w:r>
     </w:p>
     <w:p>
@@ -788,7 +780,7 @@
           <w:szCs w:val="24"/>
           <w:rtl w:val="0"/>
         </w:rPr>
-        <w:t xml:space="preserve">Why it matters: Vitamin C supports several things high school students care about — skin, immune defense, mood, and recovery.</w:t>
+        <w:t>Why it matters: Vitamin C supports normal immune function, collagen production for skin and tissue health, and iron absorption.</w:t>
       </w:r>
     </w:p>
     <w:p>
@@ -810,7 +802,7 @@
           <w:szCs w:val="24"/>
           <w:rtl w:val="0"/>
         </w:rPr>
-        <w:t xml:space="preserve">Collagen and appearance: Vitamin C is essential for making collagen, the protein that keeps skin, blood vessels, cartilage, and wounds healthy. If you want clearer skin and faster healing from scrapes or acne-related inflammation, vitamin C is part of that process.</w:t>
+        <w:t>Collagen and tissue health: Vitamin C is essential for making collagen, the protein that supports skin, blood vessels, cartilage, and wound healing.</w:t>
       </w:r>
     </w:p>
     <w:p>
@@ -832,7 +824,7 @@
           <w:szCs w:val="24"/>
           <w:rtl w:val="0"/>
         </w:rPr>
-        <w:t xml:space="preserve">Immunity and staying in school: It helps immune cells work better, so you’re less likely to be sidelined by colds before exams or big games.</w:t>
+        <w:t>Immune function: Vitamin C supports normal immune cell activity as part of a healthy diet.</w:t>
       </w:r>
     </w:p>
     <w:p>
@@ -854,7 +846,7 @@
           <w:szCs w:val="24"/>
           <w:rtl w:val="0"/>
         </w:rPr>
-        <w:t xml:space="preserve">Antioxidant protection: Vitamin C neutralizes free radicals (damaging molecules) that build up from stress, pollution, or intense exercise. Less damage can mean lower risk of long-term issues and better overall recovery.</w:t>
+        <w:t>Antioxidant function: Vitamin C acts as an antioxidant, helping to neutralize free radicals.</w:t>
       </w:r>
     </w:p>
     <w:p>
@@ -876,7 +868,7 @@
           <w:szCs w:val="24"/>
           <w:rtl w:val="0"/>
         </w:rPr>
-        <w:t xml:space="preserve">Iron absorption and energy: Vitamin C helps your body absorb iron from plant foods. Better iron absorption means more oxygen reaches your brain and muscles, improving energy and focus.</w:t>
+        <w:t>Iron absorption: Vitamin C helps your body absorb iron from plant foods, which supports normal oxygen transport in the blood.</w:t>
       </w:r>
     </w:p>
     <w:p>
@@ -898,23 +890,20 @@
           <w:szCs w:val="24"/>
           <w:rtl w:val="0"/>
         </w:rPr>
-        <w:t xml:space="preserve">Brain and mood: Vitamin C helps produce neurotransmitters involved in mood regulation. Adequate levels can </w:t>
-      </w:r>
-      <w:r>
-        <w:rPr>
-          <w:sz w:val="24"/>
-          <w:szCs w:val="24"/>
-          <w:rtl w:val="0"/>
-        </w:rPr>
-        <w:t xml:space="preserve">support steadier</w:t>
-      </w:r>
-      <w:r>
-        <w:rPr>
-          <w:sz w:val="24"/>
-          <w:szCs w:val="24"/>
-          <w:rtl w:val="0"/>
-        </w:rPr>
-        <w:t xml:space="preserve"> mood and clearer thinking under pressure.</w:t>
+      </w:r>
+      <w:r>
+        <w:rPr>
+          <w:sz w:val="24"/>
+          <w:szCs w:val="24"/>
+          <w:rtl w:val="0"/>
+        </w:rPr>
+      </w:r>
+      <w:r>
+        <w:rPr>
+          <w:sz w:val="24"/>
+          <w:szCs w:val="24"/>
+          <w:rtl w:val="0"/>
+        </w:rPr>
       </w:r>
     </w:p>
     <w:p>
@@ -981,7 +970,7 @@
           <w:szCs w:val="26"/>
           <w:rtl w:val="0"/>
         </w:rPr>
-        <w:t xml:space="preserve">Reading Title: Water-Soluble Vitamins Energy Tracker</w:t>
+        <w:t>Reading Title: Water-Soluble Vitamin Case Studies</w:t>
       </w:r>
     </w:p>
     <w:p>
@@ -1066,7 +1055,7 @@
           <w:szCs w:val="26"/>
           <w:rtl w:val="0"/>
         </w:rPr>
-        <w:t xml:space="preserve">You will:</w:t>
+        <w:t>Read each fictional scenario and answer: (1) Which water-soluble vitamins might be relevant? (2) What foods could help? (3) What else could be affecting how this person feels?</w:t>
       </w:r>
     </w:p>
     <w:p>
@@ -1088,7 +1077,7 @@
           <w:szCs w:val="26"/>
           <w:rtl w:val="0"/>
         </w:rPr>
-        <w:t xml:space="preserve">Draw a timeline of yesterday:</w:t>
+        <w:t>Review these case studies and answer the questions for each:</w:t>
       </w:r>
     </w:p>
     <w:p>
@@ -1155,7 +1144,6 @@
           <w:szCs w:val="26"/>
           <w:rtl w:val="0"/>
         </w:rPr>
-        <w:t xml:space="preserve">energy level at 3–5 points</w:t>
       </w:r>
     </w:p>
     <w:p>
@@ -1177,7 +1165,6 @@
           <w:szCs w:val="26"/>
           <w:rtl w:val="0"/>
         </w:rPr>
-        <w:t xml:space="preserve">foods eaten before each point</w:t>
       </w:r>
     </w:p>
     <w:p>
@@ -1227,7 +1214,6 @@
           <w:szCs w:val="26"/>
           <w:rtl w:val="0"/>
         </w:rPr>
-        <w:t xml:space="preserve">Circle patterns:</w:t>
       </w:r>
     </w:p>
     <w:p>
@@ -1249,7 +1235,6 @@
           <w:szCs w:val="26"/>
           <w:rtl w:val="0"/>
         </w:rPr>
-        <w:t xml:space="preserve">energy dips</w:t>
       </w:r>
     </w:p>
     <w:p>
@@ -1271,7 +1256,6 @@
           <w:szCs w:val="26"/>
           <w:rtl w:val="0"/>
         </w:rPr>
-        <w:t xml:space="preserve">focus loss</w:t>
       </w:r>
     </w:p>
     <w:p>
@@ -1293,7 +1277,6 @@
           <w:szCs w:val="26"/>
           <w:rtl w:val="0"/>
         </w:rPr>
-        <w:t xml:space="preserve">Label missing nutrients (B vitamins, Vitamin C)</w:t>
       </w:r>
     </w:p>
     <w:p>
@@ -1387,7 +1370,6 @@
           <w:szCs w:val="26"/>
           <w:rtl w:val="0"/>
         </w:rPr>
-        <w:t xml:space="preserve">How do my eating patterns around water soluble vitamins affect my performance in the classroom and athletics?</w:t>
       </w:r>
     </w:p>
     <w:p>
@@ -1435,7 +1417,6 @@
           <w:szCs w:val="26"/>
           <w:rtl w:val="0"/>
         </w:rPr>
-        <w:t xml:space="preserve">Create a commitment to change 1 habit to improve your energy levels.</w:t>
       </w:r>
     </w:p>
     <w:p>
@@ -1453,15 +1434,13 @@
           <w:szCs w:val="26"/>
           <w:rtl w:val="0"/>
         </w:rPr>
-        <w:t xml:space="preserve">Example: </w:t>
-      </w:r>
-      <w:r>
-        <w:rPr>
-          <w:sz w:val="24"/>
-          <w:szCs w:val="24"/>
-          <w:rtl w:val="0"/>
-        </w:rPr>
-        <w:t xml:space="preserve">“I will eat a fruit or vegetable with at least 2 meals per day for the next week and track my energy.”</w:t>
+      </w:r>
+      <w:r>
+        <w:rPr>
+          <w:sz w:val="24"/>
+          <w:szCs w:val="24"/>
+          <w:rtl w:val="0"/>
+        </w:rPr>
       </w:r>
     </w:p>
     <w:p>

</xml_diff>